<commit_message>
docs(proposal): group number, supervisor title, verified references
</commit_message>
<xml_diff>
--- a/plan/proposal/NutriScan_CSE491_Proposal_v1.docx
+++ b/plan/proposal/NutriScan_CSE491_Proposal_v1.docx
@@ -233,7 +233,7 @@
               <w:spacing w:after="60"/>
             </w:pPr>
             <w:r>
-              <w:t>[GROUP NO]</w:t>
+              <w:t>9</w:t>
             </w:r>
           </w:p>
         </w:tc>
@@ -302,7 +302,7 @@
               <w:spacing w:after="60"/>
             </w:pPr>
             <w:r>
-              <w:t>Res. Asst. Dr. Taha Yiğit Alkan</w:t>
+              <w:t>Dr. Taha Yiğit Alkan</w:t>
             </w:r>
           </w:p>
         </w:tc>
@@ -5849,7 +5849,7 @@
     </w:p>
     <w:p>
       <w:r>
-        <w:t>[1] Türk Gıda Kodeksi Gıda Etiketleme ve Tüketicileri Bilgilendirme Yönetmeliği, Resmî Gazete 29960, 26.01.2017.</w:t>
+        <w:t>[1] Türk Gıda Kodeksi Gıda Etiketleme ve Tüketicileri Bilgilendirme Yönetmeliği, Resmî Gazete 29960 (mükerrer), 26.01.2017.</w:t>
       </w:r>
     </w:p>
     <w:p>
@@ -5874,7 +5874,7 @@
     </w:p>
     <w:p>
       <w:r>
-        <w:t>[6] A. P. Davis et al., "Comparative Toxicogenomics Database (CTD): update 2025," Nucleic Acids Research, vol. 53, no. D1, p. D1328, 2025.</w:t>
+        <w:t>[6] A. P. Davis et al., "Comparative Toxicogenomics Database's 20th anniversary: update 2025," Nucleic Acids Research, vol. 53, no. D1, pp. D1328–D1334, 2025.</w:t>
       </w:r>
     </w:p>
     <w:p>
@@ -5884,17 +5884,17 @@
     </w:p>
     <w:p>
       <w:r>
-        <w:t>[8] M. Sung et al., "Biomedical Entity Representations with Synonym Marginalization," in Proc. ACL, 2020, pp. 3641–3650.</w:t>
+        <w:t>[8] M. Sung, H. Jeon, J. Lee and J. Kang, "Biomedical Entity Representations with Synonym Marginalization," in Proc. 58th Annual Meeting of the ACL, 2020, pp. 3641–3650.</w:t>
       </w:r>
     </w:p>
     <w:p>
       <w:r>
-        <w:t>[9] F. Liu et al., "Self-Alignment Pretraining for Biomedical Entity Representations," in Proc. NAACL-HLT, 2021, pp. 4228–4238.</w:t>
+        <w:t>[9] F. Liu, E. Shareghi, Z. Meng, M. Basaldella and N. Collier, "Self-Alignment Pretraining for Biomedical Entity Representations," in Proc. NAACL-HLT, 2021, pp. 4228–4238.</w:t>
       </w:r>
     </w:p>
     <w:p>
       <w:r>
-        <w:t>[10] Türk Gıda Kodeksi Gıda Katkı Maddeleri Yönetmeliği, current consolidated text, https://www.mevzuat.gov.tr</w:t>
+        <w:t>[10] Türk Gıda Kodeksi Gıda Katkı Maddeleri Yönetmeliği, Resmî Gazete 28693, 30.06.2013 (with later amendments).</w:t>
       </w:r>
     </w:p>
     <w:p>
@@ -5909,22 +5909,22 @@
     </w:p>
     <w:p>
       <w:r>
-        <w:t>[13] American Diabetes Association, "Standards of Care in Diabetes—2026, Section 5," Diabetes Care, vol. 49, suppl. 1, 2026.</w:t>
+        <w:t>[13] American Diabetes Association Professional Practice Committee, "5. Facilitating Positive Health Behaviors and Well-being to Improve Health Outcomes: Standards of Care in Diabetes—2026," Diabetes Care, vol. 49, suppl. 1, pp. S89–S131, 2026, doi:10.2337/dc26-S005.</w:t>
       </w:r>
     </w:p>
     <w:p>
       <w:r>
-        <w:t>[14] KDIGO, "2024 Clinical Practice Guideline for the Evaluation and Management of Chronic Kidney Disease," Kidney International, vol. 105, no. 4S, 2024.</w:t>
+        <w:t>[14] KDIGO CKD Work Group, "KDIGO 2024 Clinical Practice Guideline for the Evaluation and Management of Chronic Kidney Disease," Kidney International, vol. 105, no. 4S, pp. S117–S314, 2024, doi:10.1016/j.kint.2023.10.018.</w:t>
       </w:r>
     </w:p>
     <w:p>
       <w:r>
-        <w:t>[15] FooDB, data compliance and licence, https://foodb.ca/compliance</w:t>
+        <w:t>[15] FooDB Version 1.0, licence statement (CC BY-NC 4.0), https://foodb.ca/</w:t>
       </w:r>
     </w:p>
     <w:p>
       <w:r>
-        <w:t>[16] TİTCK, Tıbbi Cihaz Yönetmeliği, Resmî Gazete 31499, 2021; Regulation (EU) 2017/745.</w:t>
+        <w:t>[16] TİTCK, Tıbbi Cihaz Yönetmeliği, Resmî Gazete 31499 (mükerrer), 02.06.2021; Regulation (EU) 2017/745 on medical devices.</w:t>
       </w:r>
     </w:p>
     <w:p>

</xml_diff>